<commit_message>
fix(dao): use 18 decimals for D
</commit_message>
<xml_diff>
--- a/docs/DAO基本设定.docx
+++ b/docs/DAO基本设定.docx
@@ -437,7 +437,7 @@
           <w:spacing w:val="0"/>
           <w:color w:val="0E121D"/>
         </w:rPr>
-        <w:t xml:space="preserve">8 位小数，类似 Bitcoin</w:t>
+        <w:t xml:space="preserve">18 位小数，和 DealCoin（DC）常用精度一致</w:t>
       </w:r>
     </w:p>
     <w:p>
@@ -2012,7 +2012,7 @@
           <w:spacing w:val="0"/>
           <w:color w:val="0E121D"/>
         </w:rPr>
-        <w:t xml:space="preserve">固定总量 100 D，8 位精度，2.5 D 席位判断</w:t>
+        <w:t xml:space="preserve">固定总量 100 D，18 位精度，2.5 D 席位判断</w:t>
       </w:r>
     </w:p>
     <w:p>
@@ -2509,7 +2509,7 @@
           <w:spacing w:val="0"/>
           <w:color w:val="0E121D"/>
         </w:rPr>
-        <w:t xml:space="preserve">8 位</w:t>
+        <w:t xml:space="preserve">18 位</w:t>
       </w:r>
     </w:p>
     <w:p>

</xml_diff>